<commit_message>
updateltem a mail server részt
</commit_message>
<xml_diff>
--- a/mail_szerver+SYSLOG+NTP+TACACS+.docx
+++ b/mail_szerver+SYSLOG+NTP+TACACS+.docx
@@ -141,10 +141,10 @@
           <w:noProof/>
         </w:rPr>
         <w:drawing>
-          <wp:inline distT="0" distB="0" distL="0" distR="0" wp14:anchorId="0CFE5540" wp14:editId="1DE384C5">
-            <wp:extent cx="5760720" cy="2296795"/>
-            <wp:effectExtent l="0" t="0" r="0" b="8255"/>
-            <wp:docPr id="1123389334" name="Kép 1" descr="A képen szöveg, képernyőkép, Betűtípus, szoftver látható&#10;&#10;Előfordulhat, hogy az AI által létrehozott tartalom helytelen."/>
+          <wp:inline distT="0" distB="0" distL="0" distR="0" wp14:anchorId="73340998" wp14:editId="2A6C92E7">
+            <wp:extent cx="5760720" cy="1313180"/>
+            <wp:effectExtent l="0" t="0" r="0" b="1270"/>
+            <wp:docPr id="1679009453" name="Kép 2"/>
             <wp:cNvGraphicFramePr>
               <a:graphicFrameLocks xmlns:a="http://schemas.openxmlformats.org/drawingml/2006/main" noChangeAspect="1"/>
             </wp:cNvGraphicFramePr>
@@ -152,11 +152,17 @@
               <a:graphicData uri="http://schemas.openxmlformats.org/drawingml/2006/picture">
                 <pic:pic xmlns:pic="http://schemas.openxmlformats.org/drawingml/2006/picture">
                   <pic:nvPicPr>
-                    <pic:cNvPr id="1123389334" name="Kép 1" descr="A képen szöveg, képernyőkép, Betűtípus, szoftver látható&#10;&#10;Előfordulhat, hogy az AI által létrehozott tartalom helytelen."/>
+                    <pic:cNvPr id="1679009453" name="Kép 1679009453"/>
                     <pic:cNvPicPr/>
                   </pic:nvPicPr>
                   <pic:blipFill>
-                    <a:blip r:embed="rId5"/>
+                    <a:blip r:embed="rId5">
+                      <a:extLst>
+                        <a:ext uri="{28A0092B-C50C-407E-A947-70E740481C1C}">
+                          <a14:useLocalDpi xmlns:a14="http://schemas.microsoft.com/office/drawing/2010/main" val="0"/>
+                        </a:ext>
+                      </a:extLst>
+                    </a:blip>
                     <a:stretch>
                       <a:fillRect/>
                     </a:stretch>
@@ -164,7 +170,7 @@
                   <pic:spPr>
                     <a:xfrm>
                       <a:off x="0" y="0"/>
-                      <a:ext cx="5760720" cy="2296795"/>
+                      <a:ext cx="5760720" cy="1313180"/>
                     </a:xfrm>
                     <a:prstGeom prst="rect">
                       <a:avLst/>
@@ -630,11 +636,7 @@
         <w:t xml:space="preserve"> -d</w:t>
       </w:r>
       <w:r>
-        <w:t xml:space="preserve"> segítségével. Ez a parancs elindította az összes szükséges konténert, többek között a </w:t>
-      </w:r>
-      <w:r>
-        <w:lastRenderedPageBreak/>
-        <w:t xml:space="preserve">Postfix, </w:t>
+        <w:t xml:space="preserve"> segítségével. Ez a parancs elindította az összes szükséges konténert, többek között a Postfix, </w:t>
       </w:r>
       <w:proofErr w:type="spellStart"/>
       <w:r>
@@ -748,6 +750,7 @@
         <w:rPr>
           <w:noProof/>
         </w:rPr>
+        <w:lastRenderedPageBreak/>
         <w:drawing>
           <wp:inline distT="0" distB="0" distL="0" distR="0" wp14:anchorId="739FCD61" wp14:editId="4AFB5423">
             <wp:extent cx="4396740" cy="2925345"/>
@@ -947,7 +950,6 @@
         <w:rPr>
           <w:noProof/>
         </w:rPr>
-        <w:lastRenderedPageBreak/>
         <w:drawing>
           <wp:inline distT="0" distB="0" distL="0" distR="0" wp14:anchorId="25CEF35F" wp14:editId="6ECB5CD7">
             <wp:extent cx="5760720" cy="3642360"/>
@@ -987,6 +989,7 @@
     </w:p>
     <w:p>
       <w:r>
+        <w:lastRenderedPageBreak/>
         <w:t xml:space="preserve">Miután a konténerek elindultak, megnyitottuk a böngészőt, és a https://localhost:8443 címen elértük a </w:t>
       </w:r>
       <w:proofErr w:type="spellStart"/>
@@ -1167,7 +1170,6 @@
     </w:p>
     <w:p>
       <w:r>
-        <w:lastRenderedPageBreak/>
         <w:t xml:space="preserve">A következő lépésben megnyitottuk a </w:t>
       </w:r>
       <w:proofErr w:type="spellStart"/>
@@ -1226,6 +1228,7 @@
     </w:p>
     <w:p>
       <w:r>
+        <w:lastRenderedPageBreak/>
         <w:tab/>
       </w:r>
       <w:r>
@@ -1295,6 +1298,77 @@
     </w:p>
     <w:p>
       <w:r>
+        <w:t xml:space="preserve">Létrehoztunk tűzfal szabályokat a legnagyobb biztonság érdekében az </w:t>
+      </w:r>
+      <w:proofErr w:type="spellStart"/>
+      <w:r>
+        <w:rPr>
+          <w:b/>
+          <w:bCs/>
+          <w:color w:val="C00000"/>
+          <w:u w:val="single"/>
+        </w:rPr>
+        <w:t>ufw</w:t>
+      </w:r>
+      <w:proofErr w:type="spellEnd"/>
+      <w:r>
+        <w:t xml:space="preserve"> kiegészítőprogram használatával.</w:t>
+      </w:r>
+    </w:p>
+    <w:p>
+      <w:pPr>
+        <w:jc w:val="center"/>
+      </w:pPr>
+      <w:r>
+        <w:rPr>
+          <w:noProof/>
+        </w:rPr>
+        <w:drawing>
+          <wp:inline distT="0" distB="0" distL="0" distR="0" wp14:anchorId="4A0309FA" wp14:editId="16926359">
+            <wp:extent cx="4143942" cy="4076700"/>
+            <wp:effectExtent l="0" t="0" r="9525" b="0"/>
+            <wp:docPr id="483869882" name="Kép 3"/>
+            <wp:cNvGraphicFramePr>
+              <a:graphicFrameLocks xmlns:a="http://schemas.openxmlformats.org/drawingml/2006/main" noChangeAspect="1"/>
+            </wp:cNvGraphicFramePr>
+            <a:graphic xmlns:a="http://schemas.openxmlformats.org/drawingml/2006/main">
+              <a:graphicData uri="http://schemas.openxmlformats.org/drawingml/2006/picture">
+                <pic:pic xmlns:pic="http://schemas.openxmlformats.org/drawingml/2006/picture">
+                  <pic:nvPicPr>
+                    <pic:cNvPr id="483869882" name="Kép 483869882"/>
+                    <pic:cNvPicPr/>
+                  </pic:nvPicPr>
+                  <pic:blipFill>
+                    <a:blip r:embed="rId15">
+                      <a:extLst>
+                        <a:ext uri="{28A0092B-C50C-407E-A947-70E740481C1C}">
+                          <a14:useLocalDpi xmlns:a14="http://schemas.microsoft.com/office/drawing/2010/main" val="0"/>
+                        </a:ext>
+                      </a:extLst>
+                    </a:blip>
+                    <a:stretch>
+                      <a:fillRect/>
+                    </a:stretch>
+                  </pic:blipFill>
+                  <pic:spPr>
+                    <a:xfrm>
+                      <a:off x="0" y="0"/>
+                      <a:ext cx="4174739" cy="4106997"/>
+                    </a:xfrm>
+                    <a:prstGeom prst="rect">
+                      <a:avLst/>
+                    </a:prstGeom>
+                  </pic:spPr>
+                </pic:pic>
+              </a:graphicData>
+            </a:graphic>
+          </wp:inline>
+        </w:drawing>
+      </w:r>
+    </w:p>
+    <w:p>
+      <w:r>
+        <w:lastRenderedPageBreak/>
         <w:t xml:space="preserve">Windows szerveren az létrehoztam a DNS-ét a szervernek és beillesztettem a </w:t>
       </w:r>
       <w:proofErr w:type="spellStart"/>

</xml_diff>

<commit_message>
syslog es ntp megvan
</commit_message>
<xml_diff>
--- a/mail_szerver+SYSLOG+NTP+TACACS+.docx
+++ b/mail_szerver+SYSLOG+NTP+TACACS+.docx
@@ -1377,8 +1377,1347 @@
       </w:r>
       <w:proofErr w:type="spellEnd"/>
       <w:r>
+        <w:t>.</w:t>
+      </w:r>
+    </w:p>
+    <w:p>
+      <w:proofErr w:type="spellStart"/>
+      <w:r>
+        <w:rPr>
+          <w:highlight w:val="red"/>
+        </w:rPr>
+        <w:t>Tacacs</w:t>
+      </w:r>
+      <w:proofErr w:type="spellEnd"/>
+      <w:r>
+        <w:rPr>
+          <w:highlight w:val="red"/>
+        </w:rPr>
+        <w:t>+ szolgáltatás</w:t>
+      </w:r>
+      <w:r>
+        <w:t xml:space="preserve"> </w:t>
+      </w:r>
+    </w:p>
+    <w:p>
+      <w:r>
+        <w:t xml:space="preserve">Dockeres TACACS+ szerver: </w:t>
+      </w:r>
+    </w:p>
+    <w:p>
+      <w:pPr>
+        <w:jc w:val="both"/>
+      </w:pPr>
+      <w:r>
+        <w:t xml:space="preserve">A vizsgaremek részeként egy TACACS+ hitelesítési szervert kellett telepítenem Debian 12 operációs rendszerre. A telepítés során több akadályba ütköztem, mivel a klasszikus </w:t>
+      </w:r>
+      <w:proofErr w:type="spellStart"/>
+      <w:r>
+        <w:t>tacacs</w:t>
+      </w:r>
+      <w:proofErr w:type="spellEnd"/>
+      <w:r>
+        <w:t xml:space="preserve">+ csomag már nem érhető el a Debian 12 hivatalos tárolóiban. </w:t>
+      </w:r>
+      <w:proofErr w:type="gramStart"/>
+      <w:r>
+        <w:t>A</w:t>
+      </w:r>
+      <w:proofErr w:type="gramEnd"/>
+      <w:r>
+        <w:t xml:space="preserve"> </w:t>
+      </w:r>
+      <w:proofErr w:type="spellStart"/>
+      <w:r>
+        <w:t>apt</w:t>
+      </w:r>
+      <w:proofErr w:type="spellEnd"/>
+      <w:r>
+        <w:t xml:space="preserve"> </w:t>
+      </w:r>
+      <w:proofErr w:type="spellStart"/>
+      <w:r>
+        <w:t>install</w:t>
+      </w:r>
+      <w:proofErr w:type="spellEnd"/>
+      <w:r>
+        <w:t xml:space="preserve"> </w:t>
+      </w:r>
+      <w:proofErr w:type="spellStart"/>
+      <w:r>
+        <w:t>tacacs</w:t>
+      </w:r>
+      <w:proofErr w:type="spellEnd"/>
+      <w:r>
+        <w:t>+ parancs hibát adott, ezért alternatív megoldást kerestem.</w:t>
+      </w:r>
+    </w:p>
+    <w:p>
+      <w:pPr>
+        <w:jc w:val="both"/>
+      </w:pPr>
+      <w:r>
+        <w:t xml:space="preserve">Első lépésként megpróbáltam különböző TACACS+ implementációkat forrásból fordítani (Facebook </w:t>
+      </w:r>
+      <w:proofErr w:type="spellStart"/>
+      <w:r>
+        <w:t>tac_plus</w:t>
+      </w:r>
+      <w:proofErr w:type="spellEnd"/>
+      <w:r>
+        <w:t xml:space="preserve">, MarcHagen </w:t>
+      </w:r>
+      <w:proofErr w:type="spellStart"/>
+      <w:r>
+        <w:t>tac_plus</w:t>
+      </w:r>
+      <w:proofErr w:type="spellEnd"/>
+      <w:r>
+        <w:t xml:space="preserve">, </w:t>
+      </w:r>
+      <w:proofErr w:type="spellStart"/>
+      <w:r>
+        <w:t>MarcJHuber</w:t>
+      </w:r>
+      <w:proofErr w:type="spellEnd"/>
+      <w:r>
+        <w:t xml:space="preserve"> </w:t>
+      </w:r>
+      <w:proofErr w:type="spellStart"/>
+      <w:r>
+        <w:t>tac_plus-ng</w:t>
+      </w:r>
+      <w:proofErr w:type="spellEnd"/>
+      <w:r>
+        <w:t xml:space="preserve">). A fordítás azonban minden esetben hibába ütközött: hiányzó </w:t>
+      </w:r>
+      <w:proofErr w:type="spellStart"/>
+      <w:r>
+        <w:t>Makefile</w:t>
+      </w:r>
+      <w:proofErr w:type="spellEnd"/>
+      <w:r>
+        <w:t xml:space="preserve">, hiányzó fejlécek (pl. </w:t>
+      </w:r>
+      <w:proofErr w:type="spellStart"/>
+      <w:r>
+        <w:t>token.h</w:t>
+      </w:r>
+      <w:proofErr w:type="spellEnd"/>
+      <w:r>
+        <w:t>), illetve hiányzó fejlesztői könyvtárak miatt a folyamat nem volt befejezhető.</w:t>
+      </w:r>
+    </w:p>
+    <w:p>
+      <w:pPr>
+        <w:jc w:val="both"/>
+      </w:pPr>
+      <w:r>
+        <w:t xml:space="preserve">A fejlesztők dokumentációja alapján a TACACS+ NG szerver legstabilabb módja a Docker konténer használata, mivel ebben minden függőség előre össze van csomagolva. Ezért létrehoztam a szükséges konfigurációs könyvtárakat, majd elkészítettem a TACACS+ konfigurációs fájlt. Ezután elindítottam a </w:t>
+      </w:r>
+      <w:proofErr w:type="spellStart"/>
+      <w:r>
+        <w:t>christianbecker</w:t>
+      </w:r>
+      <w:proofErr w:type="spellEnd"/>
+      <w:r>
+        <w:t>/</w:t>
+      </w:r>
+      <w:proofErr w:type="spellStart"/>
+      <w:r>
+        <w:t>tac_plus-ng</w:t>
+      </w:r>
+      <w:proofErr w:type="spellEnd"/>
+      <w:r>
+        <w:t xml:space="preserve"> konténert, amely a konfiguráció betöltése után stabilan futott.</w:t>
+      </w:r>
+    </w:p>
+    <w:p>
+      <w:pPr>
+        <w:jc w:val="both"/>
+      </w:pPr>
+      <w:r>
+        <w:t xml:space="preserve">A konténer a 49-es TCP </w:t>
+      </w:r>
+      <w:proofErr w:type="spellStart"/>
+      <w:r>
+        <w:t>porton</w:t>
+      </w:r>
+      <w:proofErr w:type="spellEnd"/>
+      <w:r>
+        <w:t xml:space="preserve"> érhető el, és a konfigurációs fájlban definiált felhasználókkal képes hitelesítést végezni hálózati eszközök számára. A megoldás teljes mértékben működőképes, és megfelel a vizsgaremek követelményeinek.</w:t>
+      </w:r>
+    </w:p>
+    <w:p>
+      <w:r>
+        <w:drawing>
+          <wp:inline distT="0" distB="0" distL="0" distR="0" wp14:anchorId="31063CF1" wp14:editId="5F213837">
+            <wp:extent cx="5760720" cy="1353185"/>
+            <wp:effectExtent l="0" t="0" r="0" b="0"/>
+            <wp:docPr id="1022826722" name="Kép 1"/>
+            <wp:cNvGraphicFramePr>
+              <a:graphicFrameLocks xmlns:a="http://schemas.openxmlformats.org/drawingml/2006/main" noChangeAspect="1"/>
+            </wp:cNvGraphicFramePr>
+            <a:graphic xmlns:a="http://schemas.openxmlformats.org/drawingml/2006/main">
+              <a:graphicData uri="http://schemas.openxmlformats.org/drawingml/2006/picture">
+                <pic:pic xmlns:pic="http://schemas.openxmlformats.org/drawingml/2006/picture">
+                  <pic:nvPicPr>
+                    <pic:cNvPr id="1022826722" name=""/>
+                    <pic:cNvPicPr/>
+                  </pic:nvPicPr>
+                  <pic:blipFill>
+                    <a:blip r:embed="rId16"/>
+                    <a:stretch>
+                      <a:fillRect/>
+                    </a:stretch>
+                  </pic:blipFill>
+                  <pic:spPr>
+                    <a:xfrm>
+                      <a:off x="0" y="0"/>
+                      <a:ext cx="5760720" cy="1353185"/>
+                    </a:xfrm>
+                    <a:prstGeom prst="rect">
+                      <a:avLst/>
+                    </a:prstGeom>
+                  </pic:spPr>
+                </pic:pic>
+              </a:graphicData>
+            </a:graphic>
+          </wp:inline>
+        </w:drawing>
+      </w:r>
+    </w:p>
+    <w:p>
+      <w:r>
+        <w:rPr>
+          <w:highlight w:val="red"/>
+        </w:rPr>
+        <w:t>SYSLOG:</w:t>
+      </w:r>
+      <w:r>
+        <w:t xml:space="preserve"> </w:t>
+      </w:r>
+    </w:p>
+    <w:p>
+      <w:pPr>
+        <w:jc w:val="both"/>
+      </w:pPr>
+      <w:r>
+        <w:t xml:space="preserve">A rendszerüzemeltetés egyik alapvető feladata a naplózási és időszinkronizációs szolgáltatások megfelelő konfigurálása. A </w:t>
+      </w:r>
+      <w:r>
+        <w:rPr>
+          <w:b/>
+          <w:bCs/>
+        </w:rPr>
+        <w:t>SYSLOG</w:t>
+      </w:r>
+      <w:r>
+        <w:t xml:space="preserve"> biztosítja, hogy a rendszer és a hálózati eszközök naplóüzenetei központi helyre kerüljenek, míg az </w:t>
+      </w:r>
+      <w:r>
+        <w:rPr>
+          <w:b/>
+          <w:bCs/>
+        </w:rPr>
+        <w:t>NTP</w:t>
+      </w:r>
+      <w:r>
+        <w:t xml:space="preserve"> (Network Time </w:t>
+      </w:r>
+      <w:proofErr w:type="spellStart"/>
+      <w:r>
+        <w:t>Protocol</w:t>
+      </w:r>
+      <w:proofErr w:type="spellEnd"/>
+      <w:r>
+        <w:t>) gondoskodik arról, hogy a szerver órája pontos legyen.</w:t>
+      </w:r>
+    </w:p>
+    <w:p>
+      <w:pPr>
+        <w:jc w:val="both"/>
+      </w:pPr>
+      <w:r>
+        <w:t xml:space="preserve">A Debian alapértelmezett naplózó rendszere az </w:t>
+      </w:r>
+      <w:proofErr w:type="spellStart"/>
+      <w:r>
+        <w:rPr>
+          <w:b/>
+          <w:bCs/>
+        </w:rPr>
+        <w:t>rsyslog</w:t>
+      </w:r>
+      <w:proofErr w:type="spellEnd"/>
+      <w:r>
+        <w:t xml:space="preserve">, amely képes távoli eszközöktől érkező </w:t>
+      </w:r>
+      <w:proofErr w:type="spellStart"/>
+      <w:r>
+        <w:t>logok</w:t>
+      </w:r>
+      <w:proofErr w:type="spellEnd"/>
+      <w:r>
+        <w:t xml:space="preserve"> fogadására is.</w:t>
+      </w:r>
+      <w:r>
+        <w:t xml:space="preserve"> </w:t>
+      </w:r>
+      <w:r>
+        <w:t>A telepítést a következő paranccsal ellenőriztem:</w:t>
+      </w:r>
+    </w:p>
+    <w:p>
+      <w:pPr>
+        <w:jc w:val="center"/>
+      </w:pPr>
+      <w:r>
+        <w:drawing>
+          <wp:inline distT="0" distB="0" distL="0" distR="0" wp14:anchorId="19CB0E83" wp14:editId="65A1B6F6">
+            <wp:extent cx="5760720" cy="415925"/>
+            <wp:effectExtent l="0" t="0" r="0" b="3175"/>
+            <wp:docPr id="446964729" name="Kép 1"/>
+            <wp:cNvGraphicFramePr>
+              <a:graphicFrameLocks xmlns:a="http://schemas.openxmlformats.org/drawingml/2006/main" noChangeAspect="1"/>
+            </wp:cNvGraphicFramePr>
+            <a:graphic xmlns:a="http://schemas.openxmlformats.org/drawingml/2006/main">
+              <a:graphicData uri="http://schemas.openxmlformats.org/drawingml/2006/picture">
+                <pic:pic xmlns:pic="http://schemas.openxmlformats.org/drawingml/2006/picture">
+                  <pic:nvPicPr>
+                    <pic:cNvPr id="446964729" name=""/>
+                    <pic:cNvPicPr/>
+                  </pic:nvPicPr>
+                  <pic:blipFill>
+                    <a:blip r:embed="rId17"/>
+                    <a:stretch>
+                      <a:fillRect/>
+                    </a:stretch>
+                  </pic:blipFill>
+                  <pic:spPr>
+                    <a:xfrm>
+                      <a:off x="0" y="0"/>
+                      <a:ext cx="5760720" cy="415925"/>
+                    </a:xfrm>
+                    <a:prstGeom prst="rect">
+                      <a:avLst/>
+                    </a:prstGeom>
+                  </pic:spPr>
+                </pic:pic>
+              </a:graphicData>
+            </a:graphic>
+          </wp:inline>
+        </w:drawing>
+      </w:r>
+    </w:p>
+    <w:p>
+      <w:pPr>
+        <w:jc w:val="both"/>
+      </w:pPr>
+      <w:r>
+        <w:t xml:space="preserve">Az </w:t>
+      </w:r>
+      <w:proofErr w:type="spellStart"/>
+      <w:r>
+        <w:t>rsyslog</w:t>
+      </w:r>
+      <w:proofErr w:type="spellEnd"/>
+      <w:r>
+        <w:t xml:space="preserve"> konfigurációs fájljában engedélyeztem az UDP és TCP alapú logfogadást.</w:t>
+      </w:r>
+    </w:p>
+    <w:p>
+      <w:pPr>
+        <w:jc w:val="both"/>
+      </w:pPr>
+      <w:r>
+        <w:lastRenderedPageBreak/>
+        <w:t>A fájl szerkesztése:</w:t>
+      </w:r>
+      <w:r>
+        <w:t xml:space="preserve"> </w:t>
+      </w:r>
+      <w:proofErr w:type="spellStart"/>
+      <w:r>
+        <w:t>sudo</w:t>
+      </w:r>
+      <w:proofErr w:type="spellEnd"/>
+      <w:r>
+        <w:t xml:space="preserve"> </w:t>
+      </w:r>
+      <w:proofErr w:type="spellStart"/>
+      <w:r>
+        <w:t>nano</w:t>
+      </w:r>
+      <w:proofErr w:type="spellEnd"/>
+      <w:r>
+        <w:t xml:space="preserve"> /</w:t>
+      </w:r>
+      <w:proofErr w:type="spellStart"/>
+      <w:r>
+        <w:t>etc</w:t>
+      </w:r>
+      <w:proofErr w:type="spellEnd"/>
+      <w:r>
+        <w:t>/</w:t>
+      </w:r>
+      <w:proofErr w:type="spellStart"/>
+      <w:r>
+        <w:t>rsyslog.conf</w:t>
+      </w:r>
+      <w:proofErr w:type="spellEnd"/>
+      <w:r>
+        <w:t xml:space="preserve"> </w:t>
+      </w:r>
+    </w:p>
+    <w:p>
+      <w:pPr>
+        <w:jc w:val="both"/>
+      </w:pPr>
+      <w:r>
+        <w:t>A következő sorokat aktiváltam (kivettem a kommentet):</w:t>
+      </w:r>
+    </w:p>
+    <w:p>
+      <w:pPr>
+        <w:pStyle w:val="Listaszerbekezds"/>
+        <w:numPr>
+          <w:ilvl w:val="0"/>
+          <w:numId w:val="10"/>
+        </w:numPr>
+        <w:jc w:val="both"/>
+      </w:pPr>
+      <w:proofErr w:type="spellStart"/>
+      <w:r>
+        <w:t>module</w:t>
+      </w:r>
+      <w:proofErr w:type="spellEnd"/>
+      <w:r>
+        <w:t>(</w:t>
+      </w:r>
+      <w:proofErr w:type="spellStart"/>
+      <w:r>
+        <w:t>load</w:t>
+      </w:r>
+      <w:proofErr w:type="spellEnd"/>
+      <w:r>
+        <w:t>="</w:t>
+      </w:r>
+      <w:proofErr w:type="spellStart"/>
+      <w:r>
+        <w:t>imudp</w:t>
+      </w:r>
+      <w:proofErr w:type="spellEnd"/>
+      <w:r>
+        <w:t>")</w:t>
+      </w:r>
+    </w:p>
+    <w:p>
+      <w:pPr>
+        <w:pStyle w:val="Listaszerbekezds"/>
+        <w:numPr>
+          <w:ilvl w:val="0"/>
+          <w:numId w:val="10"/>
+        </w:numPr>
+        <w:jc w:val="both"/>
+      </w:pPr>
+      <w:proofErr w:type="gramStart"/>
+      <w:r>
+        <w:t>input(</w:t>
+      </w:r>
+      <w:proofErr w:type="spellStart"/>
+      <w:proofErr w:type="gramEnd"/>
+      <w:r>
+        <w:t>type</w:t>
+      </w:r>
+      <w:proofErr w:type="spellEnd"/>
+      <w:r>
+        <w:t>="</w:t>
+      </w:r>
+      <w:proofErr w:type="spellStart"/>
+      <w:r>
+        <w:t>imudp</w:t>
+      </w:r>
+      <w:proofErr w:type="spellEnd"/>
+      <w:r>
+        <w:t>" port="514")</w:t>
+      </w:r>
+    </w:p>
+    <w:p>
+      <w:pPr>
+        <w:jc w:val="both"/>
+      </w:pPr>
+    </w:p>
+    <w:p>
+      <w:pPr>
+        <w:pStyle w:val="Listaszerbekezds"/>
+        <w:numPr>
+          <w:ilvl w:val="0"/>
+          <w:numId w:val="10"/>
+        </w:numPr>
+        <w:jc w:val="both"/>
+      </w:pPr>
+      <w:proofErr w:type="spellStart"/>
+      <w:r>
+        <w:t>module</w:t>
+      </w:r>
+      <w:proofErr w:type="spellEnd"/>
+      <w:r>
+        <w:t>(</w:t>
+      </w:r>
+      <w:proofErr w:type="spellStart"/>
+      <w:r>
+        <w:t>load</w:t>
+      </w:r>
+      <w:proofErr w:type="spellEnd"/>
+      <w:r>
+        <w:t>="</w:t>
+      </w:r>
+      <w:proofErr w:type="spellStart"/>
+      <w:r>
+        <w:t>imtcp</w:t>
+      </w:r>
+      <w:proofErr w:type="spellEnd"/>
+      <w:r>
+        <w:t>")</w:t>
+      </w:r>
+    </w:p>
+    <w:p>
+      <w:pPr>
+        <w:pStyle w:val="Listaszerbekezds"/>
+        <w:numPr>
+          <w:ilvl w:val="0"/>
+          <w:numId w:val="10"/>
+        </w:numPr>
+        <w:jc w:val="both"/>
+      </w:pPr>
+      <w:proofErr w:type="gramStart"/>
+      <w:r>
+        <w:t>input(</w:t>
+      </w:r>
+      <w:proofErr w:type="spellStart"/>
+      <w:proofErr w:type="gramEnd"/>
+      <w:r>
+        <w:t>type</w:t>
+      </w:r>
+      <w:proofErr w:type="spellEnd"/>
+      <w:r>
+        <w:t>="</w:t>
+      </w:r>
+      <w:proofErr w:type="spellStart"/>
+      <w:r>
+        <w:t>imtcp</w:t>
+      </w:r>
+      <w:proofErr w:type="spellEnd"/>
+      <w:r>
+        <w:t>" port="514")</w:t>
+      </w:r>
+    </w:p>
+    <w:p>
+      <w:pPr>
+        <w:jc w:val="both"/>
+      </w:pPr>
+      <w:r>
+        <w:t>Külön logfájl létrehozása a távoli eszközöknek</w:t>
+      </w:r>
+      <w:r>
+        <w:t xml:space="preserve">: </w:t>
+      </w:r>
+      <w:proofErr w:type="spellStart"/>
+      <w:r>
+        <w:t>sudo</w:t>
+      </w:r>
+      <w:proofErr w:type="spellEnd"/>
+      <w:r>
+        <w:t xml:space="preserve"> </w:t>
+      </w:r>
+      <w:proofErr w:type="spellStart"/>
+      <w:r>
+        <w:t>nano</w:t>
+      </w:r>
+      <w:proofErr w:type="spellEnd"/>
+      <w:r>
+        <w:t xml:space="preserve"> /</w:t>
+      </w:r>
+      <w:proofErr w:type="spellStart"/>
+      <w:r>
+        <w:t>etc</w:t>
+      </w:r>
+      <w:proofErr w:type="spellEnd"/>
+      <w:r>
+        <w:t>/</w:t>
+      </w:r>
+      <w:proofErr w:type="spellStart"/>
+      <w:r>
+        <w:t>rsyslog.d</w:t>
+      </w:r>
+      <w:proofErr w:type="spellEnd"/>
+      <w:r>
+        <w:t>/</w:t>
+      </w:r>
+      <w:proofErr w:type="spellStart"/>
+      <w:r>
+        <w:t>remote.conf</w:t>
+      </w:r>
+      <w:proofErr w:type="spellEnd"/>
+      <w:r>
         <w:t xml:space="preserve">. </w:t>
       </w:r>
+      <w:r>
+        <w:t xml:space="preserve">Ez minden bejövő </w:t>
+      </w:r>
+      <w:proofErr w:type="spellStart"/>
+      <w:r>
+        <w:t>logot</w:t>
+      </w:r>
+      <w:proofErr w:type="spellEnd"/>
+      <w:r>
+        <w:t xml:space="preserve"> a küldő eszköz nevével ellátott fájlba ment.</w:t>
+      </w:r>
+    </w:p>
+    <w:p>
+      <w:pPr>
+        <w:jc w:val="both"/>
+      </w:pPr>
+      <w:r>
+        <w:t xml:space="preserve">A Debian szerveren a következő paranccsal figyeltem a beérkező </w:t>
+      </w:r>
+      <w:proofErr w:type="spellStart"/>
+      <w:r>
+        <w:t>logokat</w:t>
+      </w:r>
+      <w:proofErr w:type="spellEnd"/>
+      <w:r>
+        <w:t>:</w:t>
+      </w:r>
+      <w:r>
+        <w:t xml:space="preserve"> </w:t>
+      </w:r>
+      <w:proofErr w:type="spellStart"/>
+      <w:r>
+        <w:t>sudo</w:t>
+      </w:r>
+      <w:proofErr w:type="spellEnd"/>
+      <w:r>
+        <w:t xml:space="preserve"> </w:t>
+      </w:r>
+      <w:proofErr w:type="spellStart"/>
+      <w:r>
+        <w:t>tail</w:t>
+      </w:r>
+      <w:proofErr w:type="spellEnd"/>
+      <w:r>
+        <w:t xml:space="preserve"> -f /var/log/</w:t>
+      </w:r>
+      <w:proofErr w:type="spellStart"/>
+      <w:r>
+        <w:t>syslog</w:t>
+      </w:r>
+      <w:proofErr w:type="spellEnd"/>
+    </w:p>
+    <w:p>
+      <w:pPr>
+        <w:jc w:val="center"/>
+      </w:pPr>
+      <w:r>
+        <w:drawing>
+          <wp:inline distT="0" distB="0" distL="0" distR="0" wp14:anchorId="15F87C2F" wp14:editId="245B222B">
+            <wp:extent cx="5760720" cy="2512060"/>
+            <wp:effectExtent l="0" t="0" r="0" b="2540"/>
+            <wp:docPr id="1918970266" name="Kép 1"/>
+            <wp:cNvGraphicFramePr>
+              <a:graphicFrameLocks xmlns:a="http://schemas.openxmlformats.org/drawingml/2006/main" noChangeAspect="1"/>
+            </wp:cNvGraphicFramePr>
+            <a:graphic xmlns:a="http://schemas.openxmlformats.org/drawingml/2006/main">
+              <a:graphicData uri="http://schemas.openxmlformats.org/drawingml/2006/picture">
+                <pic:pic xmlns:pic="http://schemas.openxmlformats.org/drawingml/2006/picture">
+                  <pic:nvPicPr>
+                    <pic:cNvPr id="1918970266" name=""/>
+                    <pic:cNvPicPr/>
+                  </pic:nvPicPr>
+                  <pic:blipFill>
+                    <a:blip r:embed="rId18"/>
+                    <a:stretch>
+                      <a:fillRect/>
+                    </a:stretch>
+                  </pic:blipFill>
+                  <pic:spPr>
+                    <a:xfrm>
+                      <a:off x="0" y="0"/>
+                      <a:ext cx="5760720" cy="2512060"/>
+                    </a:xfrm>
+                    <a:prstGeom prst="rect">
+                      <a:avLst/>
+                    </a:prstGeom>
+                  </pic:spPr>
+                </pic:pic>
+              </a:graphicData>
+            </a:graphic>
+          </wp:inline>
+        </w:drawing>
+      </w:r>
+    </w:p>
+    <w:p>
+      <w:pPr>
+        <w:jc w:val="both"/>
+      </w:pPr>
+      <w:proofErr w:type="spellStart"/>
+      <w:r>
+        <w:t>Portellenőrzés</w:t>
+      </w:r>
+      <w:proofErr w:type="spellEnd"/>
+      <w:r>
+        <w:t xml:space="preserve">: </w:t>
+      </w:r>
+    </w:p>
+    <w:p>
+      <w:pPr>
+        <w:jc w:val="center"/>
+      </w:pPr>
+      <w:r>
+        <w:drawing>
+          <wp:inline distT="0" distB="0" distL="0" distR="0" wp14:anchorId="48736BB2" wp14:editId="4F13495A">
+            <wp:extent cx="5760720" cy="2717165"/>
+            <wp:effectExtent l="0" t="0" r="0" b="6985"/>
+            <wp:docPr id="1302810670" name="Kép 1"/>
+            <wp:cNvGraphicFramePr>
+              <a:graphicFrameLocks xmlns:a="http://schemas.openxmlformats.org/drawingml/2006/main" noChangeAspect="1"/>
+            </wp:cNvGraphicFramePr>
+            <a:graphic xmlns:a="http://schemas.openxmlformats.org/drawingml/2006/main">
+              <a:graphicData uri="http://schemas.openxmlformats.org/drawingml/2006/picture">
+                <pic:pic xmlns:pic="http://schemas.openxmlformats.org/drawingml/2006/picture">
+                  <pic:nvPicPr>
+                    <pic:cNvPr id="1302810670" name=""/>
+                    <pic:cNvPicPr/>
+                  </pic:nvPicPr>
+                  <pic:blipFill>
+                    <a:blip r:embed="rId19"/>
+                    <a:stretch>
+                      <a:fillRect/>
+                    </a:stretch>
+                  </pic:blipFill>
+                  <pic:spPr>
+                    <a:xfrm>
+                      <a:off x="0" y="0"/>
+                      <a:ext cx="5760720" cy="2717165"/>
+                    </a:xfrm>
+                    <a:prstGeom prst="rect">
+                      <a:avLst/>
+                    </a:prstGeom>
+                  </pic:spPr>
+                </pic:pic>
+              </a:graphicData>
+            </a:graphic>
+          </wp:inline>
+        </w:drawing>
+      </w:r>
+    </w:p>
+    <w:p>
+      <w:pPr>
+        <w:jc w:val="both"/>
+      </w:pPr>
+      <w:r>
+        <w:rPr>
+          <w:highlight w:val="red"/>
+        </w:rPr>
+        <w:lastRenderedPageBreak/>
+        <w:t>NTP:</w:t>
+      </w:r>
+    </w:p>
+    <w:p>
+      <w:pPr>
+        <w:jc w:val="both"/>
+      </w:pPr>
+      <w:r>
+        <w:t>A konfigurációs fájl szerkesztése:</w:t>
+      </w:r>
+      <w:r>
+        <w:t xml:space="preserve"> </w:t>
+      </w:r>
+      <w:proofErr w:type="spellStart"/>
+      <w:r>
+        <w:t>sudo</w:t>
+      </w:r>
+      <w:proofErr w:type="spellEnd"/>
+      <w:r>
+        <w:t xml:space="preserve"> </w:t>
+      </w:r>
+      <w:proofErr w:type="spellStart"/>
+      <w:r>
+        <w:t>nano</w:t>
+      </w:r>
+      <w:proofErr w:type="spellEnd"/>
+      <w:r>
+        <w:t xml:space="preserve"> /</w:t>
+      </w:r>
+      <w:proofErr w:type="spellStart"/>
+      <w:r>
+        <w:t>etc</w:t>
+      </w:r>
+      <w:proofErr w:type="spellEnd"/>
+      <w:r>
+        <w:t>/</w:t>
+      </w:r>
+      <w:proofErr w:type="spellStart"/>
+      <w:r>
+        <w:t>ntp.conf</w:t>
+      </w:r>
+      <w:proofErr w:type="spellEnd"/>
+    </w:p>
+    <w:p>
+      <w:pPr>
+        <w:jc w:val="both"/>
+      </w:pPr>
+      <w:r>
+        <w:t>A következő időforrásokat adtam meg:</w:t>
+      </w:r>
+    </w:p>
+    <w:p>
+      <w:pPr>
+        <w:pStyle w:val="Listaszerbekezds"/>
+        <w:numPr>
+          <w:ilvl w:val="0"/>
+          <w:numId w:val="11"/>
+        </w:numPr>
+        <w:jc w:val="both"/>
+      </w:pPr>
+      <w:proofErr w:type="spellStart"/>
+      <w:r>
+        <w:t>pool</w:t>
+      </w:r>
+      <w:proofErr w:type="spellEnd"/>
+      <w:r>
+        <w:t xml:space="preserve"> 0.pool.ntp.org </w:t>
+      </w:r>
+      <w:proofErr w:type="spellStart"/>
+      <w:r>
+        <w:t>iburst</w:t>
+      </w:r>
+      <w:proofErr w:type="spellEnd"/>
+    </w:p>
+    <w:p>
+      <w:pPr>
+        <w:pStyle w:val="Listaszerbekezds"/>
+        <w:numPr>
+          <w:ilvl w:val="0"/>
+          <w:numId w:val="11"/>
+        </w:numPr>
+        <w:jc w:val="both"/>
+      </w:pPr>
+      <w:proofErr w:type="spellStart"/>
+      <w:r>
+        <w:t>pool</w:t>
+      </w:r>
+      <w:proofErr w:type="spellEnd"/>
+      <w:r>
+        <w:t xml:space="preserve"> 1.pool.ntp.org </w:t>
+      </w:r>
+      <w:proofErr w:type="spellStart"/>
+      <w:r>
+        <w:t>iburst</w:t>
+      </w:r>
+      <w:proofErr w:type="spellEnd"/>
+    </w:p>
+    <w:p>
+      <w:pPr>
+        <w:pStyle w:val="Listaszerbekezds"/>
+        <w:numPr>
+          <w:ilvl w:val="0"/>
+          <w:numId w:val="11"/>
+        </w:numPr>
+        <w:jc w:val="both"/>
+      </w:pPr>
+      <w:proofErr w:type="spellStart"/>
+      <w:r>
+        <w:t>pool</w:t>
+      </w:r>
+      <w:proofErr w:type="spellEnd"/>
+      <w:r>
+        <w:t xml:space="preserve"> 2.pool.ntp.org </w:t>
+      </w:r>
+      <w:proofErr w:type="spellStart"/>
+      <w:r>
+        <w:t>iburst</w:t>
+      </w:r>
+      <w:proofErr w:type="spellEnd"/>
+    </w:p>
+    <w:p>
+      <w:pPr>
+        <w:pStyle w:val="Listaszerbekezds"/>
+        <w:numPr>
+          <w:ilvl w:val="0"/>
+          <w:numId w:val="11"/>
+        </w:numPr>
+        <w:jc w:val="both"/>
+      </w:pPr>
+      <w:proofErr w:type="spellStart"/>
+      <w:r>
+        <w:t>pool</w:t>
+      </w:r>
+      <w:proofErr w:type="spellEnd"/>
+      <w:r>
+        <w:t xml:space="preserve"> 3.pool.ntp.org </w:t>
+      </w:r>
+      <w:proofErr w:type="spellStart"/>
+      <w:r>
+        <w:t>iburst</w:t>
+      </w:r>
+      <w:proofErr w:type="spellEnd"/>
+    </w:p>
+    <w:p>
+      <w:pPr>
+        <w:jc w:val="both"/>
+      </w:pPr>
+      <w:r>
+        <w:t xml:space="preserve">Az </w:t>
+      </w:r>
+      <w:proofErr w:type="spellStart"/>
+      <w:r>
+        <w:rPr>
+          <w:i/>
+          <w:iCs/>
+        </w:rPr>
+        <w:t>iburst</w:t>
+      </w:r>
+      <w:proofErr w:type="spellEnd"/>
+      <w:r>
+        <w:t xml:space="preserve"> opció gyors szinkronizációt biztosít.</w:t>
+      </w:r>
+    </w:p>
+    <w:p>
+      <w:pPr>
+        <w:jc w:val="both"/>
+      </w:pPr>
+      <w:r>
+        <w:t>NTP működésének ellenőrzése</w:t>
+      </w:r>
+      <w:r>
+        <w:t xml:space="preserve">: </w:t>
+      </w:r>
+    </w:p>
+    <w:p>
+      <w:pPr>
+        <w:jc w:val="center"/>
+      </w:pPr>
+      <w:r>
+        <w:drawing>
+          <wp:inline distT="0" distB="0" distL="0" distR="0" wp14:anchorId="6027D091" wp14:editId="407DEDDE">
+            <wp:extent cx="6048143" cy="1461368"/>
+            <wp:effectExtent l="0" t="0" r="0" b="5715"/>
+            <wp:docPr id="1991059158" name="Kép 1"/>
+            <wp:cNvGraphicFramePr>
+              <a:graphicFrameLocks xmlns:a="http://schemas.openxmlformats.org/drawingml/2006/main" noChangeAspect="1"/>
+            </wp:cNvGraphicFramePr>
+            <a:graphic xmlns:a="http://schemas.openxmlformats.org/drawingml/2006/main">
+              <a:graphicData uri="http://schemas.openxmlformats.org/drawingml/2006/picture">
+                <pic:pic xmlns:pic="http://schemas.openxmlformats.org/drawingml/2006/picture">
+                  <pic:nvPicPr>
+                    <pic:cNvPr id="1991059158" name=""/>
+                    <pic:cNvPicPr/>
+                  </pic:nvPicPr>
+                  <pic:blipFill>
+                    <a:blip r:embed="rId20"/>
+                    <a:stretch>
+                      <a:fillRect/>
+                    </a:stretch>
+                  </pic:blipFill>
+                  <pic:spPr>
+                    <a:xfrm>
+                      <a:off x="0" y="0"/>
+                      <a:ext cx="6083667" cy="1469951"/>
+                    </a:xfrm>
+                    <a:prstGeom prst="rect">
+                      <a:avLst/>
+                    </a:prstGeom>
+                  </pic:spPr>
+                </pic:pic>
+              </a:graphicData>
+            </a:graphic>
+          </wp:inline>
+        </w:drawing>
+      </w:r>
+    </w:p>
+    <w:p>
+      <w:pPr>
+        <w:jc w:val="center"/>
+      </w:pPr>
+      <w:r>
+        <w:t xml:space="preserve">Ez a parancs a </w:t>
+      </w:r>
+      <w:r>
+        <w:rPr>
+          <w:b/>
+          <w:bCs/>
+        </w:rPr>
+        <w:t>Debian rendszer időbeállításait</w:t>
+      </w:r>
+      <w:r>
+        <w:t xml:space="preserve"> mutatja. A képen látható információk:</w:t>
+      </w:r>
+    </w:p>
+    <w:p>
+      <w:pPr>
+        <w:numPr>
+          <w:ilvl w:val="0"/>
+          <w:numId w:val="12"/>
+        </w:numPr>
+        <w:jc w:val="center"/>
+      </w:pPr>
+      <w:r>
+        <w:rPr>
+          <w:b/>
+          <w:bCs/>
+        </w:rPr>
+        <w:t xml:space="preserve">Local </w:t>
+      </w:r>
+      <w:proofErr w:type="spellStart"/>
+      <w:r>
+        <w:rPr>
+          <w:b/>
+          <w:bCs/>
+        </w:rPr>
+        <w:t>time</w:t>
+      </w:r>
+      <w:proofErr w:type="spellEnd"/>
+      <w:r>
+        <w:t>: a gép helyi ideje (CET időzóna szerint)</w:t>
+      </w:r>
+    </w:p>
+    <w:p>
+      <w:pPr>
+        <w:numPr>
+          <w:ilvl w:val="0"/>
+          <w:numId w:val="12"/>
+        </w:numPr>
+        <w:jc w:val="center"/>
+      </w:pPr>
+      <w:proofErr w:type="spellStart"/>
+      <w:r>
+        <w:rPr>
+          <w:b/>
+          <w:bCs/>
+        </w:rPr>
+        <w:t>Universal</w:t>
+      </w:r>
+      <w:proofErr w:type="spellEnd"/>
+      <w:r>
+        <w:rPr>
+          <w:b/>
+          <w:bCs/>
+        </w:rPr>
+        <w:t xml:space="preserve"> </w:t>
+      </w:r>
+      <w:proofErr w:type="spellStart"/>
+      <w:r>
+        <w:rPr>
+          <w:b/>
+          <w:bCs/>
+        </w:rPr>
+        <w:t>time</w:t>
+      </w:r>
+      <w:proofErr w:type="spellEnd"/>
+      <w:r>
+        <w:t>: az UTC idő</w:t>
+      </w:r>
+    </w:p>
+    <w:p>
+      <w:pPr>
+        <w:numPr>
+          <w:ilvl w:val="0"/>
+          <w:numId w:val="12"/>
+        </w:numPr>
+        <w:jc w:val="center"/>
+      </w:pPr>
+      <w:r>
+        <w:rPr>
+          <w:b/>
+          <w:bCs/>
+        </w:rPr>
+        <w:t xml:space="preserve">RTC </w:t>
+      </w:r>
+      <w:proofErr w:type="spellStart"/>
+      <w:r>
+        <w:rPr>
+          <w:b/>
+          <w:bCs/>
+        </w:rPr>
+        <w:t>time</w:t>
+      </w:r>
+      <w:proofErr w:type="spellEnd"/>
+      <w:r>
+        <w:t>: a hardveróra ideje</w:t>
+      </w:r>
+    </w:p>
+    <w:p>
+      <w:pPr>
+        <w:numPr>
+          <w:ilvl w:val="0"/>
+          <w:numId w:val="12"/>
+        </w:numPr>
+        <w:jc w:val="center"/>
+      </w:pPr>
+      <w:r>
+        <w:rPr>
+          <w:b/>
+          <w:bCs/>
+        </w:rPr>
+        <w:t xml:space="preserve">Time </w:t>
+      </w:r>
+      <w:proofErr w:type="spellStart"/>
+      <w:r>
+        <w:rPr>
+          <w:b/>
+          <w:bCs/>
+        </w:rPr>
+        <w:t>zone</w:t>
+      </w:r>
+      <w:proofErr w:type="spellEnd"/>
+      <w:r>
+        <w:t>: Europe/Budapest (CET, +0100)</w:t>
+      </w:r>
+    </w:p>
+    <w:p>
+      <w:pPr>
+        <w:jc w:val="center"/>
+      </w:pPr>
+      <w:r>
+        <w:drawing>
+          <wp:inline distT="0" distB="0" distL="0" distR="0" wp14:anchorId="21A83658" wp14:editId="3199723D">
+            <wp:extent cx="6024623" cy="2388731"/>
+            <wp:effectExtent l="0" t="0" r="0" b="0"/>
+            <wp:docPr id="1393816927" name="Kép 1"/>
+            <wp:cNvGraphicFramePr>
+              <a:graphicFrameLocks xmlns:a="http://schemas.openxmlformats.org/drawingml/2006/main" noChangeAspect="1"/>
+            </wp:cNvGraphicFramePr>
+            <a:graphic xmlns:a="http://schemas.openxmlformats.org/drawingml/2006/main">
+              <a:graphicData uri="http://schemas.openxmlformats.org/drawingml/2006/picture">
+                <pic:pic xmlns:pic="http://schemas.openxmlformats.org/drawingml/2006/picture">
+                  <pic:nvPicPr>
+                    <pic:cNvPr id="1393816927" name=""/>
+                    <pic:cNvPicPr/>
+                  </pic:nvPicPr>
+                  <pic:blipFill>
+                    <a:blip r:embed="rId21"/>
+                    <a:stretch>
+                      <a:fillRect/>
+                    </a:stretch>
+                  </pic:blipFill>
+                  <pic:spPr>
+                    <a:xfrm>
+                      <a:off x="0" y="0"/>
+                      <a:ext cx="6036694" cy="2393517"/>
+                    </a:xfrm>
+                    <a:prstGeom prst="rect">
+                      <a:avLst/>
+                    </a:prstGeom>
+                  </pic:spPr>
+                </pic:pic>
+              </a:graphicData>
+            </a:graphic>
+          </wp:inline>
+        </w:drawing>
+      </w:r>
+    </w:p>
+    <w:p>
+      <w:pPr>
+        <w:jc w:val="center"/>
+      </w:pPr>
+      <w:r>
+        <w:t xml:space="preserve">Ez a parancs az </w:t>
+      </w:r>
+      <w:r>
+        <w:rPr>
+          <w:b/>
+          <w:bCs/>
+        </w:rPr>
+        <w:t xml:space="preserve">NTP </w:t>
+      </w:r>
+      <w:proofErr w:type="spellStart"/>
+      <w:r>
+        <w:rPr>
+          <w:b/>
+          <w:bCs/>
+        </w:rPr>
+        <w:t>daemon</w:t>
+      </w:r>
+      <w:proofErr w:type="spellEnd"/>
+      <w:r>
+        <w:rPr>
+          <w:b/>
+          <w:bCs/>
+        </w:rPr>
+        <w:t xml:space="preserve"> (</w:t>
+      </w:r>
+      <w:proofErr w:type="spellStart"/>
+      <w:r>
+        <w:rPr>
+          <w:b/>
+          <w:bCs/>
+        </w:rPr>
+        <w:t>ntpd</w:t>
+      </w:r>
+      <w:proofErr w:type="spellEnd"/>
+      <w:r>
+        <w:rPr>
+          <w:b/>
+          <w:bCs/>
+        </w:rPr>
+        <w:t>)</w:t>
+      </w:r>
+      <w:r>
+        <w:t xml:space="preserve"> által használt időforrásokat mutatja. A képen látható információk:</w:t>
+      </w:r>
+    </w:p>
+    <w:p>
+      <w:pPr>
+        <w:numPr>
+          <w:ilvl w:val="0"/>
+          <w:numId w:val="13"/>
+        </w:numPr>
+        <w:jc w:val="center"/>
+      </w:pPr>
+      <w:proofErr w:type="spellStart"/>
+      <w:r>
+        <w:rPr>
+          <w:b/>
+          <w:bCs/>
+        </w:rPr>
+        <w:lastRenderedPageBreak/>
+        <w:t>remote</w:t>
+      </w:r>
+      <w:proofErr w:type="spellEnd"/>
+      <w:r>
+        <w:t>: az NTP szerver neve vagy IP címe</w:t>
+      </w:r>
+    </w:p>
+    <w:p>
+      <w:pPr>
+        <w:numPr>
+          <w:ilvl w:val="0"/>
+          <w:numId w:val="13"/>
+        </w:numPr>
+        <w:jc w:val="center"/>
+      </w:pPr>
+      <w:proofErr w:type="spellStart"/>
+      <w:r>
+        <w:rPr>
+          <w:b/>
+          <w:bCs/>
+        </w:rPr>
+        <w:t>refid</w:t>
+      </w:r>
+      <w:proofErr w:type="spellEnd"/>
+      <w:r>
+        <w:t>: a szerver referenciája</w:t>
+      </w:r>
+    </w:p>
+    <w:p>
+      <w:pPr>
+        <w:numPr>
+          <w:ilvl w:val="0"/>
+          <w:numId w:val="13"/>
+        </w:numPr>
+        <w:jc w:val="center"/>
+      </w:pPr>
+      <w:proofErr w:type="spellStart"/>
+      <w:r>
+        <w:rPr>
+          <w:b/>
+          <w:bCs/>
+        </w:rPr>
+        <w:t>st</w:t>
+      </w:r>
+      <w:proofErr w:type="spellEnd"/>
+      <w:r>
+        <w:t xml:space="preserve">: </w:t>
+      </w:r>
+      <w:proofErr w:type="spellStart"/>
+      <w:r>
+        <w:t>stratum</w:t>
+      </w:r>
+      <w:proofErr w:type="spellEnd"/>
+      <w:r>
+        <w:t xml:space="preserve"> szint (minél kisebb, annál pontosabb)</w:t>
+      </w:r>
+    </w:p>
+    <w:p>
+      <w:pPr>
+        <w:numPr>
+          <w:ilvl w:val="0"/>
+          <w:numId w:val="13"/>
+        </w:numPr>
+        <w:jc w:val="center"/>
+      </w:pPr>
+      <w:proofErr w:type="spellStart"/>
+      <w:r>
+        <w:rPr>
+          <w:b/>
+          <w:bCs/>
+        </w:rPr>
+        <w:t>reach</w:t>
+      </w:r>
+      <w:proofErr w:type="spellEnd"/>
+      <w:r>
+        <w:t>: elérhetőség (377 = stabil kapcsolat)</w:t>
+      </w:r>
+    </w:p>
+    <w:p>
+      <w:pPr>
+        <w:numPr>
+          <w:ilvl w:val="0"/>
+          <w:numId w:val="13"/>
+        </w:numPr>
+        <w:jc w:val="center"/>
+      </w:pPr>
+      <w:proofErr w:type="spellStart"/>
+      <w:r>
+        <w:rPr>
+          <w:b/>
+          <w:bCs/>
+        </w:rPr>
+        <w:t>delay</w:t>
+      </w:r>
+      <w:proofErr w:type="spellEnd"/>
+      <w:r>
+        <w:rPr>
+          <w:b/>
+          <w:bCs/>
+        </w:rPr>
+        <w:t xml:space="preserve">, </w:t>
+      </w:r>
+      <w:proofErr w:type="spellStart"/>
+      <w:r>
+        <w:rPr>
+          <w:b/>
+          <w:bCs/>
+        </w:rPr>
+        <w:t>offset</w:t>
+      </w:r>
+      <w:proofErr w:type="spellEnd"/>
+      <w:r>
+        <w:rPr>
+          <w:b/>
+          <w:bCs/>
+        </w:rPr>
+        <w:t xml:space="preserve">, </w:t>
+      </w:r>
+      <w:proofErr w:type="spellStart"/>
+      <w:r>
+        <w:rPr>
+          <w:b/>
+          <w:bCs/>
+        </w:rPr>
+        <w:t>jitter</w:t>
+      </w:r>
+      <w:proofErr w:type="spellEnd"/>
+      <w:r>
+        <w:t>: hálózati késleltetés, időeltérés, ingadozás</w:t>
+      </w:r>
+    </w:p>
+    <w:p>
+      <w:pPr>
+        <w:jc w:val="center"/>
+      </w:pPr>
     </w:p>
     <w:sectPr>
       <w:pgSz w:w="11906" w:h="16838"/>
@@ -1691,6 +3030,119 @@
     </w:lvl>
   </w:abstractNum>
   <w:abstractNum w:abstractNumId="2" w15:restartNumberingAfterBreak="0">
+    <w:nsid w:val="282E23BE"/>
+    <w:multiLevelType w:val="hybridMultilevel"/>
+    <w:tmpl w:val="F2CE5CD6"/>
+    <w:lvl w:ilvl="0" w:tplc="040E0001">
+      <w:start w:val="1"/>
+      <w:numFmt w:val="bullet"/>
+      <w:lvlText w:val=""/>
+      <w:lvlJc w:val="left"/>
+      <w:pPr>
+        <w:ind w:left="720" w:hanging="360"/>
+      </w:pPr>
+      <w:rPr>
+        <w:rFonts w:ascii="Symbol" w:hAnsi="Symbol" w:hint="default"/>
+      </w:rPr>
+    </w:lvl>
+    <w:lvl w:ilvl="1" w:tplc="040E0003" w:tentative="1">
+      <w:start w:val="1"/>
+      <w:numFmt w:val="bullet"/>
+      <w:lvlText w:val="o"/>
+      <w:lvlJc w:val="left"/>
+      <w:pPr>
+        <w:ind w:left="1440" w:hanging="360"/>
+      </w:pPr>
+      <w:rPr>
+        <w:rFonts w:ascii="Courier New" w:hAnsi="Courier New" w:cs="Courier New" w:hint="default"/>
+      </w:rPr>
+    </w:lvl>
+    <w:lvl w:ilvl="2" w:tplc="040E0005" w:tentative="1">
+      <w:start w:val="1"/>
+      <w:numFmt w:val="bullet"/>
+      <w:lvlText w:val=""/>
+      <w:lvlJc w:val="left"/>
+      <w:pPr>
+        <w:ind w:left="2160" w:hanging="360"/>
+      </w:pPr>
+      <w:rPr>
+        <w:rFonts w:ascii="Wingdings" w:hAnsi="Wingdings" w:hint="default"/>
+      </w:rPr>
+    </w:lvl>
+    <w:lvl w:ilvl="3" w:tplc="040E0001" w:tentative="1">
+      <w:start w:val="1"/>
+      <w:numFmt w:val="bullet"/>
+      <w:lvlText w:val=""/>
+      <w:lvlJc w:val="left"/>
+      <w:pPr>
+        <w:ind w:left="2880" w:hanging="360"/>
+      </w:pPr>
+      <w:rPr>
+        <w:rFonts w:ascii="Symbol" w:hAnsi="Symbol" w:hint="default"/>
+      </w:rPr>
+    </w:lvl>
+    <w:lvl w:ilvl="4" w:tplc="040E0003" w:tentative="1">
+      <w:start w:val="1"/>
+      <w:numFmt w:val="bullet"/>
+      <w:lvlText w:val="o"/>
+      <w:lvlJc w:val="left"/>
+      <w:pPr>
+        <w:ind w:left="3600" w:hanging="360"/>
+      </w:pPr>
+      <w:rPr>
+        <w:rFonts w:ascii="Courier New" w:hAnsi="Courier New" w:cs="Courier New" w:hint="default"/>
+      </w:rPr>
+    </w:lvl>
+    <w:lvl w:ilvl="5" w:tplc="040E0005" w:tentative="1">
+      <w:start w:val="1"/>
+      <w:numFmt w:val="bullet"/>
+      <w:lvlText w:val=""/>
+      <w:lvlJc w:val="left"/>
+      <w:pPr>
+        <w:ind w:left="4320" w:hanging="360"/>
+      </w:pPr>
+      <w:rPr>
+        <w:rFonts w:ascii="Wingdings" w:hAnsi="Wingdings" w:hint="default"/>
+      </w:rPr>
+    </w:lvl>
+    <w:lvl w:ilvl="6" w:tplc="040E0001" w:tentative="1">
+      <w:start w:val="1"/>
+      <w:numFmt w:val="bullet"/>
+      <w:lvlText w:val=""/>
+      <w:lvlJc w:val="left"/>
+      <w:pPr>
+        <w:ind w:left="5040" w:hanging="360"/>
+      </w:pPr>
+      <w:rPr>
+        <w:rFonts w:ascii="Symbol" w:hAnsi="Symbol" w:hint="default"/>
+      </w:rPr>
+    </w:lvl>
+    <w:lvl w:ilvl="7" w:tplc="040E0003" w:tentative="1">
+      <w:start w:val="1"/>
+      <w:numFmt w:val="bullet"/>
+      <w:lvlText w:val="o"/>
+      <w:lvlJc w:val="left"/>
+      <w:pPr>
+        <w:ind w:left="5760" w:hanging="360"/>
+      </w:pPr>
+      <w:rPr>
+        <w:rFonts w:ascii="Courier New" w:hAnsi="Courier New" w:cs="Courier New" w:hint="default"/>
+      </w:rPr>
+    </w:lvl>
+    <w:lvl w:ilvl="8" w:tplc="040E0005" w:tentative="1">
+      <w:start w:val="1"/>
+      <w:numFmt w:val="bullet"/>
+      <w:lvlText w:val=""/>
+      <w:lvlJc w:val="left"/>
+      <w:pPr>
+        <w:ind w:left="6480" w:hanging="360"/>
+      </w:pPr>
+      <w:rPr>
+        <w:rFonts w:ascii="Wingdings" w:hAnsi="Wingdings" w:hint="default"/>
+      </w:rPr>
+    </w:lvl>
+  </w:abstractNum>
+  <w:abstractNum w:abstractNumId="3" w15:restartNumberingAfterBreak="0">
     <w:nsid w:val="29530D20"/>
     <w:multiLevelType w:val="multilevel"/>
     <w:tmpl w:val="640EE7AC"/>
@@ -1839,7 +3291,156 @@
       </w:rPr>
     </w:lvl>
   </w:abstractNum>
-  <w:abstractNum w:abstractNumId="3" w15:restartNumberingAfterBreak="0">
+  <w:abstractNum w:abstractNumId="4" w15:restartNumberingAfterBreak="0">
+    <w:nsid w:val="31E54DA9"/>
+    <w:multiLevelType w:val="multilevel"/>
+    <w:tmpl w:val="11820B56"/>
+    <w:lvl w:ilvl="0">
+      <w:start w:val="1"/>
+      <w:numFmt w:val="bullet"/>
+      <w:lvlText w:val=""/>
+      <w:lvlJc w:val="left"/>
+      <w:pPr>
+        <w:tabs>
+          <w:tab w:val="num" w:pos="720"/>
+        </w:tabs>
+        <w:ind w:left="720" w:hanging="360"/>
+      </w:pPr>
+      <w:rPr>
+        <w:rFonts w:ascii="Symbol" w:hAnsi="Symbol" w:hint="default"/>
+        <w:sz w:val="20"/>
+      </w:rPr>
+    </w:lvl>
+    <w:lvl w:ilvl="1" w:tentative="1">
+      <w:start w:val="1"/>
+      <w:numFmt w:val="bullet"/>
+      <w:lvlText w:val="o"/>
+      <w:lvlJc w:val="left"/>
+      <w:pPr>
+        <w:tabs>
+          <w:tab w:val="num" w:pos="1440"/>
+        </w:tabs>
+        <w:ind w:left="1440" w:hanging="360"/>
+      </w:pPr>
+      <w:rPr>
+        <w:rFonts w:ascii="Courier New" w:hAnsi="Courier New" w:hint="default"/>
+        <w:sz w:val="20"/>
+      </w:rPr>
+    </w:lvl>
+    <w:lvl w:ilvl="2" w:tentative="1">
+      <w:start w:val="1"/>
+      <w:numFmt w:val="bullet"/>
+      <w:lvlText w:val=""/>
+      <w:lvlJc w:val="left"/>
+      <w:pPr>
+        <w:tabs>
+          <w:tab w:val="num" w:pos="2160"/>
+        </w:tabs>
+        <w:ind w:left="2160" w:hanging="360"/>
+      </w:pPr>
+      <w:rPr>
+        <w:rFonts w:ascii="Wingdings" w:hAnsi="Wingdings" w:hint="default"/>
+        <w:sz w:val="20"/>
+      </w:rPr>
+    </w:lvl>
+    <w:lvl w:ilvl="3" w:tentative="1">
+      <w:start w:val="1"/>
+      <w:numFmt w:val="bullet"/>
+      <w:lvlText w:val=""/>
+      <w:lvlJc w:val="left"/>
+      <w:pPr>
+        <w:tabs>
+          <w:tab w:val="num" w:pos="2880"/>
+        </w:tabs>
+        <w:ind w:left="2880" w:hanging="360"/>
+      </w:pPr>
+      <w:rPr>
+        <w:rFonts w:ascii="Wingdings" w:hAnsi="Wingdings" w:hint="default"/>
+        <w:sz w:val="20"/>
+      </w:rPr>
+    </w:lvl>
+    <w:lvl w:ilvl="4" w:tentative="1">
+      <w:start w:val="1"/>
+      <w:numFmt w:val="bullet"/>
+      <w:lvlText w:val=""/>
+      <w:lvlJc w:val="left"/>
+      <w:pPr>
+        <w:tabs>
+          <w:tab w:val="num" w:pos="3600"/>
+        </w:tabs>
+        <w:ind w:left="3600" w:hanging="360"/>
+      </w:pPr>
+      <w:rPr>
+        <w:rFonts w:ascii="Wingdings" w:hAnsi="Wingdings" w:hint="default"/>
+        <w:sz w:val="20"/>
+      </w:rPr>
+    </w:lvl>
+    <w:lvl w:ilvl="5" w:tentative="1">
+      <w:start w:val="1"/>
+      <w:numFmt w:val="bullet"/>
+      <w:lvlText w:val=""/>
+      <w:lvlJc w:val="left"/>
+      <w:pPr>
+        <w:tabs>
+          <w:tab w:val="num" w:pos="4320"/>
+        </w:tabs>
+        <w:ind w:left="4320" w:hanging="360"/>
+      </w:pPr>
+      <w:rPr>
+        <w:rFonts w:ascii="Wingdings" w:hAnsi="Wingdings" w:hint="default"/>
+        <w:sz w:val="20"/>
+      </w:rPr>
+    </w:lvl>
+    <w:lvl w:ilvl="6" w:tentative="1">
+      <w:start w:val="1"/>
+      <w:numFmt w:val="bullet"/>
+      <w:lvlText w:val=""/>
+      <w:lvlJc w:val="left"/>
+      <w:pPr>
+        <w:tabs>
+          <w:tab w:val="num" w:pos="5040"/>
+        </w:tabs>
+        <w:ind w:left="5040" w:hanging="360"/>
+      </w:pPr>
+      <w:rPr>
+        <w:rFonts w:ascii="Wingdings" w:hAnsi="Wingdings" w:hint="default"/>
+        <w:sz w:val="20"/>
+      </w:rPr>
+    </w:lvl>
+    <w:lvl w:ilvl="7" w:tentative="1">
+      <w:start w:val="1"/>
+      <w:numFmt w:val="bullet"/>
+      <w:lvlText w:val=""/>
+      <w:lvlJc w:val="left"/>
+      <w:pPr>
+        <w:tabs>
+          <w:tab w:val="num" w:pos="5760"/>
+        </w:tabs>
+        <w:ind w:left="5760" w:hanging="360"/>
+      </w:pPr>
+      <w:rPr>
+        <w:rFonts w:ascii="Wingdings" w:hAnsi="Wingdings" w:hint="default"/>
+        <w:sz w:val="20"/>
+      </w:rPr>
+    </w:lvl>
+    <w:lvl w:ilvl="8" w:tentative="1">
+      <w:start w:val="1"/>
+      <w:numFmt w:val="bullet"/>
+      <w:lvlText w:val=""/>
+      <w:lvlJc w:val="left"/>
+      <w:pPr>
+        <w:tabs>
+          <w:tab w:val="num" w:pos="6480"/>
+        </w:tabs>
+        <w:ind w:left="6480" w:hanging="360"/>
+      </w:pPr>
+      <w:rPr>
+        <w:rFonts w:ascii="Wingdings" w:hAnsi="Wingdings" w:hint="default"/>
+        <w:sz w:val="20"/>
+      </w:rPr>
+    </w:lvl>
+  </w:abstractNum>
+  <w:abstractNum w:abstractNumId="5" w15:restartNumberingAfterBreak="0">
     <w:nsid w:val="39066B32"/>
     <w:multiLevelType w:val="multilevel"/>
     <w:tmpl w:val="46B855BA"/>
@@ -1988,7 +3589,7 @@
       </w:rPr>
     </w:lvl>
   </w:abstractNum>
-  <w:abstractNum w:abstractNumId="4" w15:restartNumberingAfterBreak="0">
+  <w:abstractNum w:abstractNumId="6" w15:restartNumberingAfterBreak="0">
     <w:nsid w:val="3D116B1A"/>
     <w:multiLevelType w:val="multilevel"/>
     <w:tmpl w:val="277C32B6"/>
@@ -2137,7 +3738,7 @@
       </w:rPr>
     </w:lvl>
   </w:abstractNum>
-  <w:abstractNum w:abstractNumId="5" w15:restartNumberingAfterBreak="0">
+  <w:abstractNum w:abstractNumId="7" w15:restartNumberingAfterBreak="0">
     <w:nsid w:val="403629E4"/>
     <w:multiLevelType w:val="multilevel"/>
     <w:tmpl w:val="A63A7ABC"/>
@@ -2286,7 +3887,7 @@
       </w:rPr>
     </w:lvl>
   </w:abstractNum>
-  <w:abstractNum w:abstractNumId="6" w15:restartNumberingAfterBreak="0">
+  <w:abstractNum w:abstractNumId="8" w15:restartNumberingAfterBreak="0">
     <w:nsid w:val="421E424D"/>
     <w:multiLevelType w:val="multilevel"/>
     <w:tmpl w:val="7C44C390"/>
@@ -2435,7 +4036,120 @@
       </w:rPr>
     </w:lvl>
   </w:abstractNum>
-  <w:abstractNum w:abstractNumId="7" w15:restartNumberingAfterBreak="0">
+  <w:abstractNum w:abstractNumId="9" w15:restartNumberingAfterBreak="0">
+    <w:nsid w:val="57145EB7"/>
+    <w:multiLevelType w:val="hybridMultilevel"/>
+    <w:tmpl w:val="D80E1046"/>
+    <w:lvl w:ilvl="0" w:tplc="040E0001">
+      <w:start w:val="1"/>
+      <w:numFmt w:val="bullet"/>
+      <w:lvlText w:val=""/>
+      <w:lvlJc w:val="left"/>
+      <w:pPr>
+        <w:ind w:left="720" w:hanging="360"/>
+      </w:pPr>
+      <w:rPr>
+        <w:rFonts w:ascii="Symbol" w:hAnsi="Symbol" w:hint="default"/>
+      </w:rPr>
+    </w:lvl>
+    <w:lvl w:ilvl="1" w:tplc="040E0003" w:tentative="1">
+      <w:start w:val="1"/>
+      <w:numFmt w:val="bullet"/>
+      <w:lvlText w:val="o"/>
+      <w:lvlJc w:val="left"/>
+      <w:pPr>
+        <w:ind w:left="1440" w:hanging="360"/>
+      </w:pPr>
+      <w:rPr>
+        <w:rFonts w:ascii="Courier New" w:hAnsi="Courier New" w:cs="Courier New" w:hint="default"/>
+      </w:rPr>
+    </w:lvl>
+    <w:lvl w:ilvl="2" w:tplc="040E0005" w:tentative="1">
+      <w:start w:val="1"/>
+      <w:numFmt w:val="bullet"/>
+      <w:lvlText w:val=""/>
+      <w:lvlJc w:val="left"/>
+      <w:pPr>
+        <w:ind w:left="2160" w:hanging="360"/>
+      </w:pPr>
+      <w:rPr>
+        <w:rFonts w:ascii="Wingdings" w:hAnsi="Wingdings" w:hint="default"/>
+      </w:rPr>
+    </w:lvl>
+    <w:lvl w:ilvl="3" w:tplc="040E0001" w:tentative="1">
+      <w:start w:val="1"/>
+      <w:numFmt w:val="bullet"/>
+      <w:lvlText w:val=""/>
+      <w:lvlJc w:val="left"/>
+      <w:pPr>
+        <w:ind w:left="2880" w:hanging="360"/>
+      </w:pPr>
+      <w:rPr>
+        <w:rFonts w:ascii="Symbol" w:hAnsi="Symbol" w:hint="default"/>
+      </w:rPr>
+    </w:lvl>
+    <w:lvl w:ilvl="4" w:tplc="040E0003" w:tentative="1">
+      <w:start w:val="1"/>
+      <w:numFmt w:val="bullet"/>
+      <w:lvlText w:val="o"/>
+      <w:lvlJc w:val="left"/>
+      <w:pPr>
+        <w:ind w:left="3600" w:hanging="360"/>
+      </w:pPr>
+      <w:rPr>
+        <w:rFonts w:ascii="Courier New" w:hAnsi="Courier New" w:cs="Courier New" w:hint="default"/>
+      </w:rPr>
+    </w:lvl>
+    <w:lvl w:ilvl="5" w:tplc="040E0005" w:tentative="1">
+      <w:start w:val="1"/>
+      <w:numFmt w:val="bullet"/>
+      <w:lvlText w:val=""/>
+      <w:lvlJc w:val="left"/>
+      <w:pPr>
+        <w:ind w:left="4320" w:hanging="360"/>
+      </w:pPr>
+      <w:rPr>
+        <w:rFonts w:ascii="Wingdings" w:hAnsi="Wingdings" w:hint="default"/>
+      </w:rPr>
+    </w:lvl>
+    <w:lvl w:ilvl="6" w:tplc="040E0001" w:tentative="1">
+      <w:start w:val="1"/>
+      <w:numFmt w:val="bullet"/>
+      <w:lvlText w:val=""/>
+      <w:lvlJc w:val="left"/>
+      <w:pPr>
+        <w:ind w:left="5040" w:hanging="360"/>
+      </w:pPr>
+      <w:rPr>
+        <w:rFonts w:ascii="Symbol" w:hAnsi="Symbol" w:hint="default"/>
+      </w:rPr>
+    </w:lvl>
+    <w:lvl w:ilvl="7" w:tplc="040E0003" w:tentative="1">
+      <w:start w:val="1"/>
+      <w:numFmt w:val="bullet"/>
+      <w:lvlText w:val="o"/>
+      <w:lvlJc w:val="left"/>
+      <w:pPr>
+        <w:ind w:left="5760" w:hanging="360"/>
+      </w:pPr>
+      <w:rPr>
+        <w:rFonts w:ascii="Courier New" w:hAnsi="Courier New" w:cs="Courier New" w:hint="default"/>
+      </w:rPr>
+    </w:lvl>
+    <w:lvl w:ilvl="8" w:tplc="040E0005" w:tentative="1">
+      <w:start w:val="1"/>
+      <w:numFmt w:val="bullet"/>
+      <w:lvlText w:val=""/>
+      <w:lvlJc w:val="left"/>
+      <w:pPr>
+        <w:ind w:left="6480" w:hanging="360"/>
+      </w:pPr>
+      <w:rPr>
+        <w:rFonts w:ascii="Wingdings" w:hAnsi="Wingdings" w:hint="default"/>
+      </w:rPr>
+    </w:lvl>
+  </w:abstractNum>
+  <w:abstractNum w:abstractNumId="10" w15:restartNumberingAfterBreak="0">
     <w:nsid w:val="69BD3DAC"/>
     <w:multiLevelType w:val="multilevel"/>
     <w:tmpl w:val="7BACE000"/>
@@ -2584,10 +4298,159 @@
       </w:rPr>
     </w:lvl>
   </w:abstractNum>
-  <w:abstractNum w:abstractNumId="8" w15:restartNumberingAfterBreak="0">
+  <w:abstractNum w:abstractNumId="11" w15:restartNumberingAfterBreak="0">
     <w:nsid w:val="6E656948"/>
     <w:multiLevelType w:val="multilevel"/>
     <w:tmpl w:val="552E41F6"/>
+    <w:lvl w:ilvl="0">
+      <w:start w:val="1"/>
+      <w:numFmt w:val="bullet"/>
+      <w:lvlText w:val=""/>
+      <w:lvlJc w:val="left"/>
+      <w:pPr>
+        <w:tabs>
+          <w:tab w:val="num" w:pos="720"/>
+        </w:tabs>
+        <w:ind w:left="720" w:hanging="360"/>
+      </w:pPr>
+      <w:rPr>
+        <w:rFonts w:ascii="Symbol" w:hAnsi="Symbol" w:hint="default"/>
+        <w:sz w:val="20"/>
+      </w:rPr>
+    </w:lvl>
+    <w:lvl w:ilvl="1" w:tentative="1">
+      <w:start w:val="1"/>
+      <w:numFmt w:val="bullet"/>
+      <w:lvlText w:val="o"/>
+      <w:lvlJc w:val="left"/>
+      <w:pPr>
+        <w:tabs>
+          <w:tab w:val="num" w:pos="1440"/>
+        </w:tabs>
+        <w:ind w:left="1440" w:hanging="360"/>
+      </w:pPr>
+      <w:rPr>
+        <w:rFonts w:ascii="Courier New" w:hAnsi="Courier New" w:hint="default"/>
+        <w:sz w:val="20"/>
+      </w:rPr>
+    </w:lvl>
+    <w:lvl w:ilvl="2" w:tentative="1">
+      <w:start w:val="1"/>
+      <w:numFmt w:val="bullet"/>
+      <w:lvlText w:val=""/>
+      <w:lvlJc w:val="left"/>
+      <w:pPr>
+        <w:tabs>
+          <w:tab w:val="num" w:pos="2160"/>
+        </w:tabs>
+        <w:ind w:left="2160" w:hanging="360"/>
+      </w:pPr>
+      <w:rPr>
+        <w:rFonts w:ascii="Wingdings" w:hAnsi="Wingdings" w:hint="default"/>
+        <w:sz w:val="20"/>
+      </w:rPr>
+    </w:lvl>
+    <w:lvl w:ilvl="3" w:tentative="1">
+      <w:start w:val="1"/>
+      <w:numFmt w:val="bullet"/>
+      <w:lvlText w:val=""/>
+      <w:lvlJc w:val="left"/>
+      <w:pPr>
+        <w:tabs>
+          <w:tab w:val="num" w:pos="2880"/>
+        </w:tabs>
+        <w:ind w:left="2880" w:hanging="360"/>
+      </w:pPr>
+      <w:rPr>
+        <w:rFonts w:ascii="Wingdings" w:hAnsi="Wingdings" w:hint="default"/>
+        <w:sz w:val="20"/>
+      </w:rPr>
+    </w:lvl>
+    <w:lvl w:ilvl="4" w:tentative="1">
+      <w:start w:val="1"/>
+      <w:numFmt w:val="bullet"/>
+      <w:lvlText w:val=""/>
+      <w:lvlJc w:val="left"/>
+      <w:pPr>
+        <w:tabs>
+          <w:tab w:val="num" w:pos="3600"/>
+        </w:tabs>
+        <w:ind w:left="3600" w:hanging="360"/>
+      </w:pPr>
+      <w:rPr>
+        <w:rFonts w:ascii="Wingdings" w:hAnsi="Wingdings" w:hint="default"/>
+        <w:sz w:val="20"/>
+      </w:rPr>
+    </w:lvl>
+    <w:lvl w:ilvl="5" w:tentative="1">
+      <w:start w:val="1"/>
+      <w:numFmt w:val="bullet"/>
+      <w:lvlText w:val=""/>
+      <w:lvlJc w:val="left"/>
+      <w:pPr>
+        <w:tabs>
+          <w:tab w:val="num" w:pos="4320"/>
+        </w:tabs>
+        <w:ind w:left="4320" w:hanging="360"/>
+      </w:pPr>
+      <w:rPr>
+        <w:rFonts w:ascii="Wingdings" w:hAnsi="Wingdings" w:hint="default"/>
+        <w:sz w:val="20"/>
+      </w:rPr>
+    </w:lvl>
+    <w:lvl w:ilvl="6" w:tentative="1">
+      <w:start w:val="1"/>
+      <w:numFmt w:val="bullet"/>
+      <w:lvlText w:val=""/>
+      <w:lvlJc w:val="left"/>
+      <w:pPr>
+        <w:tabs>
+          <w:tab w:val="num" w:pos="5040"/>
+        </w:tabs>
+        <w:ind w:left="5040" w:hanging="360"/>
+      </w:pPr>
+      <w:rPr>
+        <w:rFonts w:ascii="Wingdings" w:hAnsi="Wingdings" w:hint="default"/>
+        <w:sz w:val="20"/>
+      </w:rPr>
+    </w:lvl>
+    <w:lvl w:ilvl="7" w:tentative="1">
+      <w:start w:val="1"/>
+      <w:numFmt w:val="bullet"/>
+      <w:lvlText w:val=""/>
+      <w:lvlJc w:val="left"/>
+      <w:pPr>
+        <w:tabs>
+          <w:tab w:val="num" w:pos="5760"/>
+        </w:tabs>
+        <w:ind w:left="5760" w:hanging="360"/>
+      </w:pPr>
+      <w:rPr>
+        <w:rFonts w:ascii="Wingdings" w:hAnsi="Wingdings" w:hint="default"/>
+        <w:sz w:val="20"/>
+      </w:rPr>
+    </w:lvl>
+    <w:lvl w:ilvl="8" w:tentative="1">
+      <w:start w:val="1"/>
+      <w:numFmt w:val="bullet"/>
+      <w:lvlText w:val=""/>
+      <w:lvlJc w:val="left"/>
+      <w:pPr>
+        <w:tabs>
+          <w:tab w:val="num" w:pos="6480"/>
+        </w:tabs>
+        <w:ind w:left="6480" w:hanging="360"/>
+      </w:pPr>
+      <w:rPr>
+        <w:rFonts w:ascii="Wingdings" w:hAnsi="Wingdings" w:hint="default"/>
+        <w:sz w:val="20"/>
+      </w:rPr>
+    </w:lvl>
+  </w:abstractNum>
+  <w:abstractNum w:abstractNumId="12" w15:restartNumberingAfterBreak="0">
+    <w:nsid w:val="6EDC2BF2"/>
+    <w:multiLevelType w:val="multilevel"/>
+    <w:tmpl w:val="254EA1F8"/>
     <w:lvl w:ilvl="0">
       <w:start w:val="1"/>
       <w:numFmt w:val="bullet"/>
@@ -2737,28 +4600,40 @@
     <w:abstractNumId w:val="1"/>
   </w:num>
   <w:num w:numId="2" w16cid:durableId="983310339">
-    <w:abstractNumId w:val="2"/>
+    <w:abstractNumId w:val="3"/>
   </w:num>
   <w:num w:numId="3" w16cid:durableId="280452403">
-    <w:abstractNumId w:val="5"/>
+    <w:abstractNumId w:val="7"/>
   </w:num>
   <w:num w:numId="4" w16cid:durableId="1607343348">
     <w:abstractNumId w:val="0"/>
   </w:num>
   <w:num w:numId="5" w16cid:durableId="1662847168">
+    <w:abstractNumId w:val="11"/>
+  </w:num>
+  <w:num w:numId="6" w16cid:durableId="1862275394">
+    <w:abstractNumId w:val="10"/>
+  </w:num>
+  <w:num w:numId="7" w16cid:durableId="1756828083">
+    <w:abstractNumId w:val="6"/>
+  </w:num>
+  <w:num w:numId="8" w16cid:durableId="197010548">
+    <w:abstractNumId w:val="5"/>
+  </w:num>
+  <w:num w:numId="9" w16cid:durableId="2058312400">
     <w:abstractNumId w:val="8"/>
   </w:num>
-  <w:num w:numId="6" w16cid:durableId="1862275394">
-    <w:abstractNumId w:val="7"/>
+  <w:num w:numId="10" w16cid:durableId="1102073386">
+    <w:abstractNumId w:val="9"/>
   </w:num>
-  <w:num w:numId="7" w16cid:durableId="1756828083">
+  <w:num w:numId="11" w16cid:durableId="372733420">
+    <w:abstractNumId w:val="2"/>
+  </w:num>
+  <w:num w:numId="12" w16cid:durableId="791940890">
     <w:abstractNumId w:val="4"/>
   </w:num>
-  <w:num w:numId="8" w16cid:durableId="197010548">
-    <w:abstractNumId w:val="3"/>
-  </w:num>
-  <w:num w:numId="9" w16cid:durableId="2058312400">
-    <w:abstractNumId w:val="6"/>
+  <w:num w:numId="13" w16cid:durableId="393429336">
+    <w:abstractNumId w:val="12"/>
   </w:num>
 </w:numbering>
 </file>
@@ -3366,7 +5241,6 @@
   <w:style w:type="character" w:default="1" w:styleId="Bekezdsalapbettpusa">
     <w:name w:val="Default Paragraph Font"/>
     <w:uiPriority w:val="1"/>
-    <w:semiHidden/>
     <w:unhideWhenUsed/>
   </w:style>
   <w:style w:type="table" w:default="1" w:styleId="Normltblzat">

</xml_diff>